<commit_message>
2/21 sync spec doc
</commit_message>
<xml_diff>
--- a/experiments/python/PulseTray/PulseTray spec.docx
+++ b/experiments/python/PulseTray/PulseTray spec.docx
@@ -1344,8 +1344,13 @@
         <w:t xml:space="preserve">  "</w:t>
       </w:r>
       <w:proofErr w:type="spellStart"/>
-      <w:r>
-        <w:t>poll_interval</w:t>
+      <w:proofErr w:type="gramStart"/>
+      <w:r>
+        <w:t>poll</w:t>
+      </w:r>
+      <w:proofErr w:type="gramEnd"/>
+      <w:r>
+        <w:t>_interval</w:t>
       </w:r>
       <w:proofErr w:type="spellEnd"/>
       <w:r>
@@ -1357,8 +1362,13 @@
         <w:t xml:space="preserve">  "</w:t>
       </w:r>
       <w:proofErr w:type="spellStart"/>
-      <w:r>
-        <w:t>cpu_alert</w:t>
+      <w:proofErr w:type="gramStart"/>
+      <w:r>
+        <w:t>cpu</w:t>
+      </w:r>
+      <w:proofErr w:type="gramEnd"/>
+      <w:r>
+        <w:t>_alert</w:t>
       </w:r>
       <w:proofErr w:type="spellEnd"/>
       <w:r>
@@ -1370,8 +1380,13 @@
         <w:t xml:space="preserve">  "</w:t>
       </w:r>
       <w:proofErr w:type="spellStart"/>
-      <w:r>
-        <w:t>memory_alert</w:t>
+      <w:proofErr w:type="gramStart"/>
+      <w:r>
+        <w:t>memory</w:t>
+      </w:r>
+      <w:proofErr w:type="gramEnd"/>
+      <w:r>
+        <w:t>_alert</w:t>
       </w:r>
       <w:proofErr w:type="spellEnd"/>
       <w:r>
@@ -1383,8 +1398,13 @@
         <w:t xml:space="preserve">  "</w:t>
       </w:r>
       <w:proofErr w:type="spellStart"/>
-      <w:r>
-        <w:t>disk_alert</w:t>
+      <w:proofErr w:type="gramStart"/>
+      <w:r>
+        <w:t>disk</w:t>
+      </w:r>
+      <w:proofErr w:type="gramEnd"/>
+      <w:r>
+        <w:t>_alert</w:t>
       </w:r>
       <w:proofErr w:type="spellEnd"/>
       <w:r>
@@ -1396,8 +1416,13 @@
         <w:t xml:space="preserve">  "</w:t>
       </w:r>
       <w:proofErr w:type="spellStart"/>
-      <w:r>
-        <w:t>history_minutes</w:t>
+      <w:proofErr w:type="gramStart"/>
+      <w:r>
+        <w:t>history</w:t>
+      </w:r>
+      <w:proofErr w:type="gramEnd"/>
+      <w:r>
+        <w:t>_minutes</w:t>
       </w:r>
       <w:proofErr w:type="spellEnd"/>
       <w:r>
@@ -1479,7 +1504,15 @@
     </w:p>
     <w:p>
       <w:r>
-        <w:t xml:space="preserve">│ Metrics Loop  │  ← background thread / </w:t>
+        <w:t xml:space="preserve">│ Metrics </w:t>
+      </w:r>
+      <w:proofErr w:type="gramStart"/>
+      <w:r>
+        <w:t>Loop  │</w:t>
+      </w:r>
+      <w:proofErr w:type="gramEnd"/>
+      <w:r>
+        <w:t xml:space="preserve">  ← background thread / </w:t>
       </w:r>
       <w:proofErr w:type="spellStart"/>
       <w:r>
@@ -1516,7 +1549,15 @@
     </w:p>
     <w:p>
       <w:r>
-        <w:t>│ State Store   │  ← ring buffer</w:t>
+        <w:t xml:space="preserve">│ State Store   </w:t>
+      </w:r>
+      <w:proofErr w:type="gramStart"/>
+      <w:r>
+        <w:t>│  ←</w:t>
+      </w:r>
+      <w:proofErr w:type="gramEnd"/>
+      <w:r>
+        <w:t xml:space="preserve"> ring buffer</w:t>
       </w:r>
     </w:p>
     <w:p>
@@ -1645,9 +1686,14 @@
           <w:numId w:val="11"/>
         </w:numPr>
       </w:pPr>
+      <w:proofErr w:type="gramStart"/>
       <w:r>
         <w:lastRenderedPageBreak/>
-        <w:t>Quit cleanly</w:t>
+        <w:t>Quit</w:t>
+      </w:r>
+      <w:proofErr w:type="gramEnd"/>
+      <w:r>
+        <w:t xml:space="preserve"> cleanly</w:t>
       </w:r>
     </w:p>
     <w:p>
@@ -1975,19 +2021,32 @@
       </w:r>
       <w:proofErr w:type="spellStart"/>
       <w:r>
-        <w:t>uptime_seconds</w:t>
+        <w:t>uptime_</w:t>
+      </w:r>
+      <w:proofErr w:type="gramStart"/>
+      <w:r>
+        <w:t>seconds</w:t>
       </w:r>
       <w:proofErr w:type="spellEnd"/>
+      <w:proofErr w:type="gramEnd"/>
       <w:r>
         <w:t xml:space="preserve"> value is passed to </w:t>
       </w:r>
       <w:proofErr w:type="spellStart"/>
       <w:r>
-        <w:t>MetricsCollector.format_uptime</w:t>
+        <w:t>MetricsCollector.format_</w:t>
+      </w:r>
+      <w:proofErr w:type="gramStart"/>
+      <w:r>
+        <w:t>uptime</w:t>
       </w:r>
       <w:proofErr w:type="spellEnd"/>
       <w:r>
-        <w:t xml:space="preserve">() (invoked in details_window.py) for presentation. The formatter converts seconds into a human-readable string of the form Xd </w:t>
+        <w:t>(</w:t>
+      </w:r>
+      <w:proofErr w:type="gramEnd"/>
+      <w:r>
+        <w:t xml:space="preserve">) (invoked in details_window.py) for presentation. The formatter converts seconds into a human-readable string of the form Xd </w:t>
       </w:r>
       <w:proofErr w:type="spellStart"/>
       <w:r>
@@ -2006,6 +2065,36 @@
         <w:t xml:space="preserve"> by dividing into days (86400 s), hours (3600 s), and minutes (60 s), representing time since last system boot.</w:t>
       </w:r>
     </w:p>
+    <w:p>
+      <w:pPr>
+        <w:pStyle w:val="Heading2"/>
+      </w:pPr>
+      <w:r>
+        <w:t>Last update</w:t>
+      </w:r>
+    </w:p>
+    <w:p>
+      <w:r>
+        <w:t>The Last update timestamp represents the exact time the metrics were most recently collected and rendered in the UI. It is formatted in 24-hour HH:</w:t>
+      </w:r>
+      <w:proofErr w:type="gramStart"/>
+      <w:r>
+        <w:t>MM:SS</w:t>
+      </w:r>
+      <w:proofErr w:type="gramEnd"/>
+      <w:r>
+        <w:t xml:space="preserve"> format in details_window.py (lines 188–189) using the system clock (e.g., 20:56:29 equals 8:56:29 PM). This value refreshes on each metrics collection cycle, determined by the configured </w:t>
+      </w:r>
+      <w:proofErr w:type="spellStart"/>
+      <w:r>
+        <w:t>poll_interval</w:t>
+      </w:r>
+      <w:proofErr w:type="spellEnd"/>
+      <w:r>
+        <w:t xml:space="preserve"> (typically every few seconds).</w:t>
+      </w:r>
+    </w:p>
+    <w:p/>
     <w:sectPr>
       <w:pgSz w:w="12240" w:h="15840"/>
       <w:pgMar w:top="1440" w:right="1440" w:bottom="1440" w:left="1440" w:header="720" w:footer="720" w:gutter="0"/>

</xml_diff>